<commit_message>
update  characteristics of DP docs
</commit_message>
<xml_diff>
--- a/problem_solving_techniques/Phase 2: Algorithms Mastery/problem solving approach docs/characteristics of problems where the Dynamic Programming (DP)  approach.docx
+++ b/problem_solving_techniques/Phase 2: Algorithms Mastery/problem solving approach docs/characteristics of problems where the Dynamic Programming (DP)  approach.docx
@@ -81,7 +81,6 @@
           <w:numId w:val="1"/>
         </w:numPr>
         <w:tabs>
-          <w:tab w:val="clear" w:pos="709"/>
           <w:tab w:val="left" w:pos="709" w:leader="none"/>
         </w:tabs>
         <w:bidi w:val="0"/>
@@ -109,7 +108,6 @@
           <w:numId w:val="1"/>
         </w:numPr>
         <w:tabs>
-          <w:tab w:val="clear" w:pos="709"/>
           <w:tab w:val="left" w:pos="709" w:leader="none"/>
         </w:tabs>
         <w:bidi w:val="0"/>
@@ -160,7 +158,6 @@
           <w:numId w:val="2"/>
         </w:numPr>
         <w:tabs>
-          <w:tab w:val="clear" w:pos="709"/>
           <w:tab w:val="left" w:pos="709" w:leader="none"/>
         </w:tabs>
         <w:bidi w:val="0"/>
@@ -182,7 +179,6 @@
           <w:numId w:val="2"/>
         </w:numPr>
         <w:tabs>
-          <w:tab w:val="clear" w:pos="709"/>
           <w:tab w:val="left" w:pos="709" w:leader="none"/>
         </w:tabs>
         <w:bidi w:val="0"/>
@@ -227,7 +223,6 @@
           <w:numId w:val="3"/>
         </w:numPr>
         <w:tabs>
-          <w:tab w:val="clear" w:pos="709"/>
           <w:tab w:val="left" w:pos="709" w:leader="none"/>
         </w:tabs>
         <w:bidi w:val="0"/>
@@ -249,7 +244,6 @@
           <w:numId w:val="3"/>
         </w:numPr>
         <w:tabs>
-          <w:tab w:val="clear" w:pos="709"/>
           <w:tab w:val="left" w:pos="709" w:leader="none"/>
         </w:tabs>
         <w:bidi w:val="0"/>
@@ -271,7 +265,6 @@
           <w:numId w:val="3"/>
         </w:numPr>
         <w:tabs>
-          <w:tab w:val="clear" w:pos="709"/>
           <w:tab w:val="left" w:pos="709" w:leader="none"/>
         </w:tabs>
         <w:bidi w:val="0"/>
@@ -316,7 +309,6 @@
           <w:numId w:val="4"/>
         </w:numPr>
         <w:tabs>
-          <w:tab w:val="clear" w:pos="709"/>
           <w:tab w:val="left" w:pos="709" w:leader="none"/>
         </w:tabs>
         <w:bidi w:val="0"/>
@@ -454,7 +446,6 @@
           <w:numId w:val="4"/>
         </w:numPr>
         <w:tabs>
-          <w:tab w:val="clear" w:pos="709"/>
           <w:tab w:val="left" w:pos="709" w:leader="none"/>
         </w:tabs>
         <w:bidi w:val="0"/>
@@ -560,6 +551,1062 @@
       </w:pPr>
       <w:r>
         <w:rPr/>
+        <w:t>Example Problem: Fibonacci Sequence (Using Dynamic Programming)</w:t>
+      </w:r>
+    </w:p>
+    <w:p>
+      <w:pPr>
+        <w:pStyle w:val="BodyText"/>
+        <w:rPr/>
+      </w:pPr>
+      <w:r>
+        <w:rPr/>
+        <w:t>The Fibonacci sequence is defined as:</w:t>
+      </w:r>
+    </w:p>
+    <w:p>
+      <w:pPr>
+        <w:pStyle w:val="BodyText"/>
+        <w:numPr>
+          <w:ilvl w:val="0"/>
+          <w:numId w:val="12"/>
+        </w:numPr>
+        <w:tabs>
+          <w:tab w:val="clear" w:pos="709"/>
+          <w:tab w:val="left" w:pos="0" w:leader="none"/>
+        </w:tabs>
+        <w:spacing w:before="0" w:after="0"/>
+        <w:ind w:hanging="283" w:start="709"/>
+        <w:rPr/>
+      </w:pPr>
+      <w:r>
+        <w:rPr/>
+        <w:t>F(0)=0</w:t>
+      </w:r>
+    </w:p>
+    <w:p>
+      <w:pPr>
+        <w:pStyle w:val="BodyText"/>
+        <w:numPr>
+          <w:ilvl w:val="0"/>
+          <w:numId w:val="12"/>
+        </w:numPr>
+        <w:tabs>
+          <w:tab w:val="clear" w:pos="709"/>
+          <w:tab w:val="left" w:pos="0" w:leader="none"/>
+        </w:tabs>
+        <w:spacing w:before="0" w:after="0"/>
+        <w:ind w:hanging="283" w:start="709"/>
+        <w:rPr/>
+      </w:pPr>
+      <w:r>
+        <w:rPr/>
+        <w:t>F(1)=1</w:t>
+      </w:r>
+    </w:p>
+    <w:p>
+      <w:pPr>
+        <w:pStyle w:val="BodyText"/>
+        <w:numPr>
+          <w:ilvl w:val="0"/>
+          <w:numId w:val="12"/>
+        </w:numPr>
+        <w:tabs>
+          <w:tab w:val="clear" w:pos="709"/>
+          <w:tab w:val="left" w:pos="0" w:leader="none"/>
+        </w:tabs>
+        <w:ind w:hanging="283" w:start="709"/>
+        <w:rPr/>
+      </w:pPr>
+      <w:r>
+        <w:rPr/>
+        <w:t>For n&gt;1: F(n)=F(n−1)+F(n−2)</w:t>
+      </w:r>
+    </w:p>
+    <w:p>
+      <w:pPr>
+        <w:pStyle w:val="BodyText"/>
+        <w:rPr/>
+      </w:pPr>
+      <w:r>
+        <w:rPr/>
+        <w:t>Our task is to find the n-th Fibonacci number, where n is given.</w:t>
+      </w:r>
+    </w:p>
+    <w:p>
+      <w:pPr>
+        <w:pStyle w:val="BodyText"/>
+        <w:rPr/>
+      </w:pPr>
+      <w:r>
+        <w:rPr/>
+        <w:t>While this problem can be solved using simple recursion, the overlapping subproblems make it a perfect candidate for dynamic programming, as recursion alone would recompute the same values many times.</w:t>
+      </w:r>
+    </w:p>
+    <w:p>
+      <w:pPr>
+        <w:pStyle w:val="Heading3"/>
+        <w:rPr/>
+      </w:pPr>
+      <w:r>
+        <w:rPr/>
+        <w:t>Steps to Solve the Fibonacci Sequence Using Dynamic Programming</w:t>
+      </w:r>
+    </w:p>
+    <w:p>
+      <w:pPr>
+        <w:pStyle w:val="BodyText"/>
+        <w:numPr>
+          <w:ilvl w:val="0"/>
+          <w:numId w:val="13"/>
+        </w:numPr>
+        <w:tabs>
+          <w:tab w:val="clear" w:pos="709"/>
+          <w:tab w:val="left" w:pos="0" w:leader="none"/>
+        </w:tabs>
+        <w:ind w:hanging="283" w:start="709"/>
+        <w:rPr/>
+      </w:pPr>
+      <w:r>
+        <w:rPr>
+          <w:rStyle w:val="Strong"/>
+        </w:rPr>
+        <w:t>Define the Problem</w:t>
+      </w:r>
+      <w:r>
+        <w:rPr/>
+        <w:t>:</w:t>
+      </w:r>
+    </w:p>
+    <w:p>
+      <w:pPr>
+        <w:pStyle w:val="BodyText"/>
+        <w:numPr>
+          <w:ilvl w:val="1"/>
+          <w:numId w:val="13"/>
+        </w:numPr>
+        <w:tabs>
+          <w:tab w:val="clear" w:pos="709"/>
+          <w:tab w:val="left" w:pos="0" w:leader="none"/>
+        </w:tabs>
+        <w:spacing w:before="0" w:after="0"/>
+        <w:ind w:hanging="283" w:start="1418"/>
+        <w:rPr/>
+      </w:pPr>
+      <w:r>
+        <w:rPr/>
+        <w:t>We need to find the n-th Fibonacci number.</w:t>
+      </w:r>
+    </w:p>
+    <w:p>
+      <w:pPr>
+        <w:pStyle w:val="BodyText"/>
+        <w:numPr>
+          <w:ilvl w:val="1"/>
+          <w:numId w:val="13"/>
+        </w:numPr>
+        <w:tabs>
+          <w:tab w:val="clear" w:pos="709"/>
+          <w:tab w:val="left" w:pos="0" w:leader="none"/>
+        </w:tabs>
+        <w:spacing w:before="0" w:after="0"/>
+        <w:ind w:hanging="283" w:start="1418"/>
+        <w:rPr/>
+      </w:pPr>
+      <w:r>
+        <w:rPr/>
+        <w:t>Instead of recomputing each value recursively, we can store previously computed Fibonacci numbers to avoid redundant calculations.</w:t>
+      </w:r>
+    </w:p>
+    <w:p>
+      <w:pPr>
+        <w:pStyle w:val="BodyText"/>
+        <w:numPr>
+          <w:ilvl w:val="0"/>
+          <w:numId w:val="13"/>
+        </w:numPr>
+        <w:tabs>
+          <w:tab w:val="clear" w:pos="709"/>
+          <w:tab w:val="left" w:pos="0" w:leader="none"/>
+        </w:tabs>
+        <w:ind w:hanging="283" w:start="709"/>
+        <w:rPr/>
+      </w:pPr>
+      <w:r>
+        <w:rPr>
+          <w:rStyle w:val="Strong"/>
+        </w:rPr>
+        <w:t>Identify the Overlapping Subproblems</w:t>
+      </w:r>
+      <w:r>
+        <w:rPr/>
+        <w:t>:</w:t>
+      </w:r>
+    </w:p>
+    <w:p>
+      <w:pPr>
+        <w:pStyle w:val="BodyText"/>
+        <w:numPr>
+          <w:ilvl w:val="1"/>
+          <w:numId w:val="13"/>
+        </w:numPr>
+        <w:tabs>
+          <w:tab w:val="clear" w:pos="709"/>
+          <w:tab w:val="left" w:pos="0" w:leader="none"/>
+        </w:tabs>
+        <w:spacing w:before="0" w:after="0"/>
+        <w:ind w:hanging="283" w:start="1418"/>
+        <w:rPr/>
+      </w:pPr>
+      <w:r>
+        <w:rPr/>
+        <w:t>To find F(n), we need F(n−1) and F(n−2).</w:t>
+      </w:r>
+    </w:p>
+    <w:p>
+      <w:pPr>
+        <w:pStyle w:val="BodyText"/>
+        <w:numPr>
+          <w:ilvl w:val="1"/>
+          <w:numId w:val="13"/>
+        </w:numPr>
+        <w:tabs>
+          <w:tab w:val="clear" w:pos="709"/>
+          <w:tab w:val="left" w:pos="0" w:leader="none"/>
+        </w:tabs>
+        <w:spacing w:before="0" w:after="0"/>
+        <w:ind w:hanging="283" w:start="1418"/>
+        <w:rPr/>
+      </w:pPr>
+      <w:r>
+        <w:rPr/>
+        <w:t>Calculating each Fibonacci number involves computing its predecessors, which are reused for subsequent values.</w:t>
+      </w:r>
+    </w:p>
+    <w:p>
+      <w:pPr>
+        <w:pStyle w:val="BodyText"/>
+        <w:numPr>
+          <w:ilvl w:val="0"/>
+          <w:numId w:val="13"/>
+        </w:numPr>
+        <w:tabs>
+          <w:tab w:val="clear" w:pos="709"/>
+          <w:tab w:val="left" w:pos="0" w:leader="none"/>
+        </w:tabs>
+        <w:ind w:hanging="283" w:start="709"/>
+        <w:rPr/>
+      </w:pPr>
+      <w:r>
+        <w:rPr>
+          <w:rStyle w:val="Strong"/>
+        </w:rPr>
+        <w:t>Decide on Bottom-Up or Top-Down DP</w:t>
+      </w:r>
+      <w:r>
+        <w:rPr/>
+        <w:t>:</w:t>
+      </w:r>
+    </w:p>
+    <w:p>
+      <w:pPr>
+        <w:pStyle w:val="BodyText"/>
+        <w:numPr>
+          <w:ilvl w:val="1"/>
+          <w:numId w:val="13"/>
+        </w:numPr>
+        <w:tabs>
+          <w:tab w:val="clear" w:pos="709"/>
+          <w:tab w:val="left" w:pos="0" w:leader="none"/>
+        </w:tabs>
+        <w:spacing w:before="0" w:after="0"/>
+        <w:ind w:hanging="283" w:start="1418"/>
+        <w:rPr/>
+      </w:pPr>
+      <w:r>
+        <w:rPr>
+          <w:rStyle w:val="Strong"/>
+        </w:rPr>
+        <w:t>Top-Down Approach</w:t>
+      </w:r>
+      <w:r>
+        <w:rPr/>
+        <w:t>: We start from F(n) and use recursion with memoization to store results of subproblems as we go.</w:t>
+      </w:r>
+    </w:p>
+    <w:p>
+      <w:pPr>
+        <w:pStyle w:val="BodyText"/>
+        <w:numPr>
+          <w:ilvl w:val="1"/>
+          <w:numId w:val="13"/>
+        </w:numPr>
+        <w:tabs>
+          <w:tab w:val="clear" w:pos="709"/>
+          <w:tab w:val="left" w:pos="0" w:leader="none"/>
+        </w:tabs>
+        <w:spacing w:before="0" w:after="0"/>
+        <w:ind w:hanging="283" w:start="1418"/>
+        <w:rPr/>
+      </w:pPr>
+      <w:r>
+        <w:rPr>
+          <w:rStyle w:val="Strong"/>
+        </w:rPr>
+        <w:t>Bottom-Up Approach</w:t>
+      </w:r>
+      <w:r>
+        <w:rPr/>
+        <w:t>: We start from the smallest subproblems (F(0) and F(1)) and iteratively build up to F(n).</w:t>
+      </w:r>
+    </w:p>
+    <w:p>
+      <w:pPr>
+        <w:pStyle w:val="BodyText"/>
+        <w:numPr>
+          <w:ilvl w:val="0"/>
+          <w:numId w:val="13"/>
+        </w:numPr>
+        <w:tabs>
+          <w:tab w:val="clear" w:pos="709"/>
+          <w:tab w:val="left" w:pos="0" w:leader="none"/>
+        </w:tabs>
+        <w:ind w:hanging="283" w:start="709"/>
+        <w:rPr/>
+      </w:pPr>
+      <w:r>
+        <w:rPr>
+          <w:rStyle w:val="Strong"/>
+        </w:rPr>
+        <w:t>Implement Bottom-Up Approach (Tabulation)</w:t>
+      </w:r>
+      <w:r>
+        <w:rPr/>
+        <w:t>:</w:t>
+      </w:r>
+    </w:p>
+    <w:p>
+      <w:pPr>
+        <w:pStyle w:val="BodyText"/>
+        <w:numPr>
+          <w:ilvl w:val="1"/>
+          <w:numId w:val="13"/>
+        </w:numPr>
+        <w:tabs>
+          <w:tab w:val="clear" w:pos="709"/>
+          <w:tab w:val="left" w:pos="0" w:leader="none"/>
+        </w:tabs>
+        <w:spacing w:before="0" w:after="0"/>
+        <w:ind w:hanging="283" w:start="1418"/>
+        <w:rPr/>
+      </w:pPr>
+      <w:r>
+        <w:rPr/>
+        <w:t>Start by storing F(0)=0 and F(1)=1.</w:t>
+      </w:r>
+    </w:p>
+    <w:p>
+      <w:pPr>
+        <w:pStyle w:val="BodyText"/>
+        <w:numPr>
+          <w:ilvl w:val="1"/>
+          <w:numId w:val="13"/>
+        </w:numPr>
+        <w:tabs>
+          <w:tab w:val="clear" w:pos="709"/>
+          <w:tab w:val="left" w:pos="0" w:leader="none"/>
+        </w:tabs>
+        <w:spacing w:before="0" w:after="0"/>
+        <w:ind w:hanging="283" w:start="1418"/>
+        <w:rPr/>
+      </w:pPr>
+      <w:r>
+        <w:rPr/>
+        <w:t>Calculate each Fibonacci number up to F(n) by summing the two previous numbers and storing the result.</w:t>
+      </w:r>
+    </w:p>
+    <w:p>
+      <w:pPr>
+        <w:pStyle w:val="BodyText"/>
+        <w:numPr>
+          <w:ilvl w:val="0"/>
+          <w:numId w:val="13"/>
+        </w:numPr>
+        <w:tabs>
+          <w:tab w:val="clear" w:pos="709"/>
+          <w:tab w:val="left" w:pos="0" w:leader="none"/>
+        </w:tabs>
+        <w:ind w:hanging="283" w:start="709"/>
+        <w:rPr/>
+      </w:pPr>
+      <w:r>
+        <w:rPr>
+          <w:rStyle w:val="Strong"/>
+        </w:rPr>
+        <w:t>Optimize Storage (if needed)</w:t>
+      </w:r>
+      <w:r>
+        <w:rPr/>
+        <w:t>:</w:t>
+      </w:r>
+    </w:p>
+    <w:p>
+      <w:pPr>
+        <w:pStyle w:val="BodyText"/>
+        <w:numPr>
+          <w:ilvl w:val="1"/>
+          <w:numId w:val="13"/>
+        </w:numPr>
+        <w:tabs>
+          <w:tab w:val="clear" w:pos="709"/>
+          <w:tab w:val="left" w:pos="0" w:leader="none"/>
+        </w:tabs>
+        <w:ind w:hanging="283" w:start="1418"/>
+        <w:rPr/>
+      </w:pPr>
+      <w:r>
+        <w:rPr/>
+        <w:t>Since each Fibonacci calculation only needs the last two values, we can optimize storage by keeping only two variables to store the latest results instead of an entire array.</w:t>
+      </w:r>
+    </w:p>
+    <w:p>
+      <w:pPr>
+        <w:pStyle w:val="Heading3"/>
+        <w:rPr/>
+      </w:pPr>
+      <w:r>
+        <w:rPr/>
+        <w:t>Example Walkthrough for n=5</w:t>
+      </w:r>
+    </w:p>
+    <w:p>
+      <w:pPr>
+        <w:pStyle w:val="BodyText"/>
+        <w:rPr/>
+      </w:pPr>
+      <w:r>
+        <w:rPr/>
+        <w:t>Let’s find F(5) using the bottom-up approach:</w:t>
+      </w:r>
+    </w:p>
+    <w:p>
+      <w:pPr>
+        <w:pStyle w:val="BodyText"/>
+        <w:numPr>
+          <w:ilvl w:val="0"/>
+          <w:numId w:val="14"/>
+        </w:numPr>
+        <w:tabs>
+          <w:tab w:val="clear" w:pos="709"/>
+          <w:tab w:val="left" w:pos="0" w:leader="none"/>
+        </w:tabs>
+        <w:spacing w:before="0" w:after="0"/>
+        <w:ind w:hanging="283" w:start="709"/>
+        <w:rPr/>
+      </w:pPr>
+      <w:r>
+        <w:rPr>
+          <w:rStyle w:val="Strong"/>
+        </w:rPr>
+        <w:t>Step 1</w:t>
+      </w:r>
+      <w:r>
+        <w:rPr/>
+        <w:t>: Initialize F(0)=0 and F(1)=1.</w:t>
+      </w:r>
+    </w:p>
+    <w:p>
+      <w:pPr>
+        <w:pStyle w:val="BodyText"/>
+        <w:numPr>
+          <w:ilvl w:val="0"/>
+          <w:numId w:val="14"/>
+        </w:numPr>
+        <w:tabs>
+          <w:tab w:val="clear" w:pos="709"/>
+          <w:tab w:val="left" w:pos="0" w:leader="none"/>
+        </w:tabs>
+        <w:spacing w:before="0" w:after="0"/>
+        <w:ind w:hanging="283" w:start="709"/>
+        <w:rPr/>
+      </w:pPr>
+      <w:r>
+        <w:rPr>
+          <w:rStyle w:val="Strong"/>
+        </w:rPr>
+        <w:t>Step 2</w:t>
+      </w:r>
+      <w:r>
+        <w:rPr/>
+        <w:t>: Compute subsequent Fibonacci numbers up to F(5):</w:t>
+      </w:r>
+    </w:p>
+    <w:p>
+      <w:pPr>
+        <w:pStyle w:val="BodyText"/>
+        <w:numPr>
+          <w:ilvl w:val="1"/>
+          <w:numId w:val="14"/>
+        </w:numPr>
+        <w:tabs>
+          <w:tab w:val="clear" w:pos="709"/>
+          <w:tab w:val="left" w:pos="0" w:leader="none"/>
+        </w:tabs>
+        <w:spacing w:before="0" w:after="0"/>
+        <w:ind w:hanging="283" w:start="1418"/>
+        <w:rPr/>
+      </w:pPr>
+      <w:r>
+        <w:rPr/>
+        <w:t>F(2)=F(1)+F(0)=1+0=1</w:t>
+      </w:r>
+    </w:p>
+    <w:p>
+      <w:pPr>
+        <w:pStyle w:val="BodyText"/>
+        <w:numPr>
+          <w:ilvl w:val="1"/>
+          <w:numId w:val="14"/>
+        </w:numPr>
+        <w:tabs>
+          <w:tab w:val="clear" w:pos="709"/>
+          <w:tab w:val="left" w:pos="0" w:leader="none"/>
+        </w:tabs>
+        <w:spacing w:before="0" w:after="0"/>
+        <w:ind w:hanging="283" w:start="1418"/>
+        <w:rPr/>
+      </w:pPr>
+      <w:r>
+        <w:rPr/>
+        <w:t>F(3)=F(2)+F(1)=1+1=2</w:t>
+      </w:r>
+    </w:p>
+    <w:p>
+      <w:pPr>
+        <w:pStyle w:val="BodyText"/>
+        <w:numPr>
+          <w:ilvl w:val="1"/>
+          <w:numId w:val="14"/>
+        </w:numPr>
+        <w:tabs>
+          <w:tab w:val="clear" w:pos="709"/>
+          <w:tab w:val="left" w:pos="0" w:leader="none"/>
+        </w:tabs>
+        <w:spacing w:before="0" w:after="0"/>
+        <w:ind w:hanging="283" w:start="1418"/>
+        <w:rPr/>
+      </w:pPr>
+      <w:r>
+        <w:rPr/>
+        <w:t>F(4)=F(3)+F(2)=2+1=3</w:t>
+      </w:r>
+    </w:p>
+    <w:p>
+      <w:pPr>
+        <w:pStyle w:val="BodyText"/>
+        <w:numPr>
+          <w:ilvl w:val="1"/>
+          <w:numId w:val="14"/>
+        </w:numPr>
+        <w:tabs>
+          <w:tab w:val="clear" w:pos="709"/>
+          <w:tab w:val="left" w:pos="0" w:leader="none"/>
+        </w:tabs>
+        <w:ind w:hanging="283" w:start="1418"/>
+        <w:rPr/>
+      </w:pPr>
+      <w:r>
+        <w:rPr/>
+        <w:t>F(5)=F(4)+F(3)=3+2=5</w:t>
+      </w:r>
+    </w:p>
+    <w:p>
+      <w:pPr>
+        <w:pStyle w:val="BodyText"/>
+        <w:rPr/>
+      </w:pPr>
+      <w:r>
+        <w:rPr/>
+        <w:t>Thus, F(5)=5.</w:t>
+      </w:r>
+    </w:p>
+    <w:p>
+      <w:pPr>
+        <w:pStyle w:val="Heading3"/>
+        <w:rPr/>
+      </w:pPr>
+      <w:r>
+        <w:rPr/>
+        <w:t>Why Dynamic Programming Works Here</w:t>
+      </w:r>
+    </w:p>
+    <w:p>
+      <w:pPr>
+        <w:pStyle w:val="BodyText"/>
+        <w:numPr>
+          <w:ilvl w:val="0"/>
+          <w:numId w:val="15"/>
+        </w:numPr>
+        <w:tabs>
+          <w:tab w:val="clear" w:pos="709"/>
+          <w:tab w:val="left" w:pos="0" w:leader="none"/>
+        </w:tabs>
+        <w:spacing w:before="0" w:after="0"/>
+        <w:ind w:hanging="283" w:start="709"/>
+        <w:rPr/>
+      </w:pPr>
+      <w:r>
+        <w:rPr>
+          <w:rStyle w:val="Strong"/>
+        </w:rPr>
+        <w:t>Avoids Recomputing Subproblems</w:t>
+      </w:r>
+      <w:r>
+        <w:rPr/>
+        <w:t>: By storing previous Fibonacci numbers, we don’t have to recompute them multiple times as we would in a naive recursive approach.</w:t>
+      </w:r>
+    </w:p>
+    <w:p>
+      <w:pPr>
+        <w:pStyle w:val="BodyText"/>
+        <w:numPr>
+          <w:ilvl w:val="0"/>
+          <w:numId w:val="15"/>
+        </w:numPr>
+        <w:tabs>
+          <w:tab w:val="clear" w:pos="709"/>
+          <w:tab w:val="left" w:pos="0" w:leader="none"/>
+        </w:tabs>
+        <w:spacing w:before="0" w:after="0"/>
+        <w:ind w:hanging="283" w:start="709"/>
+        <w:rPr/>
+      </w:pPr>
+      <w:r>
+        <w:rPr>
+          <w:rStyle w:val="Strong"/>
+        </w:rPr>
+        <w:t>Optimal Substructure</w:t>
+      </w:r>
+      <w:r>
+        <w:rPr/>
+        <w:t>: The Fibonacci sequence can be broken down into smaller subproblems that can be solved optimally and combined to form the solution to the original problem.</w:t>
+      </w:r>
+    </w:p>
+    <w:p>
+      <w:pPr>
+        <w:pStyle w:val="BodyText"/>
+        <w:numPr>
+          <w:ilvl w:val="0"/>
+          <w:numId w:val="15"/>
+        </w:numPr>
+        <w:tabs>
+          <w:tab w:val="clear" w:pos="709"/>
+          <w:tab w:val="left" w:pos="0" w:leader="none"/>
+        </w:tabs>
+        <w:ind w:hanging="283" w:start="709"/>
+        <w:rPr/>
+      </w:pPr>
+      <w:r>
+        <w:rPr>
+          <w:rStyle w:val="Strong"/>
+        </w:rPr>
+        <w:t>Time Complexity</w:t>
+      </w:r>
+      <w:r>
+        <w:rPr/>
+        <w:t>: The bottom-up DP approach has a time complexity of O(n) since it only involves a single pass through the numbers up to n.</w:t>
+      </w:r>
+    </w:p>
+    <w:p>
+      <w:pPr>
+        <w:pStyle w:val="Heading3"/>
+        <w:rPr/>
+      </w:pPr>
+      <w:r>
+        <w:rPr/>
+        <w:t>Another Example Problem: Minimum Steps to Reach 1 (Using Dynamic Programming)</w:t>
+      </w:r>
+    </w:p>
+    <w:p>
+      <w:pPr>
+        <w:pStyle w:val="BodyText"/>
+        <w:rPr/>
+      </w:pPr>
+      <w:r>
+        <w:rPr>
+          <w:rStyle w:val="Strong"/>
+        </w:rPr>
+        <w:t>Problem</w:t>
+      </w:r>
+      <w:r>
+        <w:rPr/>
+        <w:t>: Given a number n, find the minimum number of operations needed to reduce n to 1. You can use the following operations:</w:t>
+      </w:r>
+    </w:p>
+    <w:p>
+      <w:pPr>
+        <w:pStyle w:val="BodyText"/>
+        <w:numPr>
+          <w:ilvl w:val="0"/>
+          <w:numId w:val="16"/>
+        </w:numPr>
+        <w:tabs>
+          <w:tab w:val="clear" w:pos="709"/>
+          <w:tab w:val="left" w:pos="0" w:leader="none"/>
+        </w:tabs>
+        <w:spacing w:before="0" w:after="0"/>
+        <w:ind w:hanging="283" w:start="709"/>
+        <w:rPr/>
+      </w:pPr>
+      <w:r>
+        <w:rPr/>
+        <w:t>If n is divisible by 3, divide it by 3.</w:t>
+      </w:r>
+    </w:p>
+    <w:p>
+      <w:pPr>
+        <w:pStyle w:val="BodyText"/>
+        <w:numPr>
+          <w:ilvl w:val="0"/>
+          <w:numId w:val="16"/>
+        </w:numPr>
+        <w:tabs>
+          <w:tab w:val="clear" w:pos="709"/>
+          <w:tab w:val="left" w:pos="0" w:leader="none"/>
+        </w:tabs>
+        <w:spacing w:before="0" w:after="0"/>
+        <w:ind w:hanging="283" w:start="709"/>
+        <w:rPr/>
+      </w:pPr>
+      <w:r>
+        <w:rPr/>
+        <w:t>If n is divisible by 2, divide it by 2.</w:t>
+      </w:r>
+    </w:p>
+    <w:p>
+      <w:pPr>
+        <w:pStyle w:val="BodyText"/>
+        <w:numPr>
+          <w:ilvl w:val="0"/>
+          <w:numId w:val="16"/>
+        </w:numPr>
+        <w:tabs>
+          <w:tab w:val="clear" w:pos="709"/>
+          <w:tab w:val="left" w:pos="0" w:leader="none"/>
+        </w:tabs>
+        <w:ind w:hanging="283" w:start="709"/>
+        <w:rPr/>
+      </w:pPr>
+      <w:r>
+        <w:rPr/>
+        <w:t>Subtract 1 from n.</w:t>
+      </w:r>
+    </w:p>
+    <w:p>
+      <w:pPr>
+        <w:pStyle w:val="BodyText"/>
+        <w:rPr/>
+      </w:pPr>
+      <w:r>
+        <w:rPr>
+          <w:rStyle w:val="Strong"/>
+        </w:rPr>
+        <w:t>Solution Steps</w:t>
+      </w:r>
+      <w:r>
+        <w:rPr/>
+        <w:t>:</w:t>
+      </w:r>
+    </w:p>
+    <w:p>
+      <w:pPr>
+        <w:pStyle w:val="BodyText"/>
+        <w:numPr>
+          <w:ilvl w:val="0"/>
+          <w:numId w:val="17"/>
+        </w:numPr>
+        <w:tabs>
+          <w:tab w:val="clear" w:pos="709"/>
+          <w:tab w:val="left" w:pos="0" w:leader="none"/>
+        </w:tabs>
+        <w:ind w:hanging="283" w:start="709"/>
+        <w:rPr/>
+      </w:pPr>
+      <w:r>
+        <w:rPr>
+          <w:rStyle w:val="Strong"/>
+        </w:rPr>
+        <w:t>Define Subproblems</w:t>
+      </w:r>
+      <w:r>
+        <w:rPr/>
+        <w:t>:</w:t>
+      </w:r>
+    </w:p>
+    <w:p>
+      <w:pPr>
+        <w:pStyle w:val="BodyText"/>
+        <w:numPr>
+          <w:ilvl w:val="1"/>
+          <w:numId w:val="17"/>
+        </w:numPr>
+        <w:tabs>
+          <w:tab w:val="clear" w:pos="709"/>
+          <w:tab w:val="left" w:pos="0" w:leader="none"/>
+        </w:tabs>
+        <w:spacing w:before="0" w:after="0"/>
+        <w:ind w:hanging="283" w:start="1418"/>
+        <w:rPr/>
+      </w:pPr>
+      <w:r>
+        <w:rPr/>
+        <w:t>Let dp[i] represent the minimum number of steps needed to reach 1 from i.</w:t>
+      </w:r>
+    </w:p>
+    <w:p>
+      <w:pPr>
+        <w:pStyle w:val="BodyText"/>
+        <w:numPr>
+          <w:ilvl w:val="0"/>
+          <w:numId w:val="17"/>
+        </w:numPr>
+        <w:tabs>
+          <w:tab w:val="clear" w:pos="709"/>
+          <w:tab w:val="left" w:pos="0" w:leader="none"/>
+        </w:tabs>
+        <w:ind w:hanging="283" w:start="709"/>
+        <w:rPr/>
+      </w:pPr>
+      <w:r>
+        <w:rPr>
+          <w:rStyle w:val="Strong"/>
+        </w:rPr>
+        <w:t>Base Case</w:t>
+      </w:r>
+      <w:r>
+        <w:rPr/>
+        <w:t>:</w:t>
+      </w:r>
+    </w:p>
+    <w:p>
+      <w:pPr>
+        <w:pStyle w:val="BodyText"/>
+        <w:numPr>
+          <w:ilvl w:val="1"/>
+          <w:numId w:val="17"/>
+        </w:numPr>
+        <w:tabs>
+          <w:tab w:val="clear" w:pos="709"/>
+          <w:tab w:val="left" w:pos="0" w:leader="none"/>
+        </w:tabs>
+        <w:spacing w:before="0" w:after="0"/>
+        <w:ind w:hanging="283" w:start="1418"/>
+        <w:rPr/>
+      </w:pPr>
+      <w:r>
+        <w:rPr/>
+        <w:t>dp[1]=0, as no steps are needed to reach 1 from 1.</w:t>
+      </w:r>
+    </w:p>
+    <w:p>
+      <w:pPr>
+        <w:pStyle w:val="BodyText"/>
+        <w:numPr>
+          <w:ilvl w:val="0"/>
+          <w:numId w:val="17"/>
+        </w:numPr>
+        <w:tabs>
+          <w:tab w:val="clear" w:pos="709"/>
+          <w:tab w:val="left" w:pos="0" w:leader="none"/>
+        </w:tabs>
+        <w:ind w:hanging="283" w:start="709"/>
+        <w:rPr/>
+      </w:pPr>
+      <w:r>
+        <w:rPr>
+          <w:rStyle w:val="Strong"/>
+        </w:rPr>
+        <w:t>Recursive Relation</w:t>
+      </w:r>
+      <w:r>
+        <w:rPr/>
+        <w:t>:</w:t>
+      </w:r>
+    </w:p>
+    <w:p>
+      <w:pPr>
+        <w:pStyle w:val="BodyText"/>
+        <w:numPr>
+          <w:ilvl w:val="1"/>
+          <w:numId w:val="17"/>
+        </w:numPr>
+        <w:tabs>
+          <w:tab w:val="clear" w:pos="709"/>
+          <w:tab w:val="left" w:pos="0" w:leader="none"/>
+        </w:tabs>
+        <w:spacing w:before="0" w:after="0"/>
+        <w:ind w:hanging="283" w:start="1418"/>
+        <w:rPr/>
+      </w:pPr>
+      <w:r>
+        <w:rPr/>
+        <w:t>For each i, compute dp[i] as:</w:t>
+      </w:r>
+    </w:p>
+    <w:p>
+      <w:pPr>
+        <w:pStyle w:val="BodyText"/>
+        <w:numPr>
+          <w:ilvl w:val="2"/>
+          <w:numId w:val="17"/>
+        </w:numPr>
+        <w:tabs>
+          <w:tab w:val="clear" w:pos="709"/>
+          <w:tab w:val="left" w:pos="0" w:leader="none"/>
+        </w:tabs>
+        <w:spacing w:before="0" w:after="0"/>
+        <w:ind w:hanging="283" w:start="2127"/>
+        <w:rPr/>
+      </w:pPr>
+      <w:r>
+        <w:rPr/>
+        <w:t>dp[i−1]+1 (if we subtract 1),</w:t>
+      </w:r>
+    </w:p>
+    <w:p>
+      <w:pPr>
+        <w:pStyle w:val="BodyText"/>
+        <w:numPr>
+          <w:ilvl w:val="2"/>
+          <w:numId w:val="17"/>
+        </w:numPr>
+        <w:tabs>
+          <w:tab w:val="clear" w:pos="709"/>
+          <w:tab w:val="left" w:pos="0" w:leader="none"/>
+        </w:tabs>
+        <w:spacing w:before="0" w:after="0"/>
+        <w:ind w:hanging="283" w:start="2127"/>
+        <w:rPr/>
+      </w:pPr>
+      <w:r>
+        <w:rPr/>
+        <w:t>dp[i/2]+1 (if i is divisible by 2),</w:t>
+      </w:r>
+    </w:p>
+    <w:p>
+      <w:pPr>
+        <w:pStyle w:val="BodyText"/>
+        <w:numPr>
+          <w:ilvl w:val="2"/>
+          <w:numId w:val="17"/>
+        </w:numPr>
+        <w:tabs>
+          <w:tab w:val="clear" w:pos="709"/>
+          <w:tab w:val="left" w:pos="0" w:leader="none"/>
+        </w:tabs>
+        <w:spacing w:before="0" w:after="0"/>
+        <w:ind w:hanging="283" w:start="2127"/>
+        <w:rPr/>
+      </w:pPr>
+      <w:r>
+        <w:rPr/>
+        <w:t>dp[i/3]+1 (if i is divisible by 3).</w:t>
+      </w:r>
+    </w:p>
+    <w:p>
+      <w:pPr>
+        <w:pStyle w:val="BodyText"/>
+        <w:numPr>
+          <w:ilvl w:val="1"/>
+          <w:numId w:val="17"/>
+        </w:numPr>
+        <w:tabs>
+          <w:tab w:val="clear" w:pos="709"/>
+          <w:tab w:val="left" w:pos="0" w:leader="none"/>
+        </w:tabs>
+        <w:spacing w:before="0" w:after="0"/>
+        <w:ind w:hanging="283" w:start="1418"/>
+        <w:rPr/>
+      </w:pPr>
+      <w:r>
+        <w:rPr/>
+        <w:t>Take the minimum of these options to get dp[i].</w:t>
+      </w:r>
+    </w:p>
+    <w:p>
+      <w:pPr>
+        <w:pStyle w:val="BodyText"/>
+        <w:numPr>
+          <w:ilvl w:val="0"/>
+          <w:numId w:val="17"/>
+        </w:numPr>
+        <w:tabs>
+          <w:tab w:val="clear" w:pos="709"/>
+          <w:tab w:val="left" w:pos="0" w:leader="none"/>
+        </w:tabs>
+        <w:ind w:hanging="283" w:start="709"/>
+        <w:rPr/>
+      </w:pPr>
+      <w:r>
+        <w:rPr>
+          <w:rStyle w:val="Strong"/>
+        </w:rPr>
+        <w:t>Build the Solution in a Bottom-Up Manner</w:t>
+      </w:r>
+      <w:r>
+        <w:rPr/>
+        <w:t>:</w:t>
+      </w:r>
+    </w:p>
+    <w:p>
+      <w:pPr>
+        <w:pStyle w:val="BodyText"/>
+        <w:numPr>
+          <w:ilvl w:val="1"/>
+          <w:numId w:val="17"/>
+        </w:numPr>
+        <w:tabs>
+          <w:tab w:val="clear" w:pos="709"/>
+          <w:tab w:val="left" w:pos="0" w:leader="none"/>
+        </w:tabs>
+        <w:ind w:hanging="283" w:start="1418"/>
+        <w:rPr/>
+      </w:pPr>
+      <w:r>
+        <w:rPr/>
+        <w:t>Starting from 2 up to n, compute each dp[i] based on previously computed values.</w:t>
+      </w:r>
+    </w:p>
+    <w:p>
+      <w:pPr>
+        <w:pStyle w:val="BodyText"/>
+        <w:rPr/>
+      </w:pPr>
+      <w:r>
+        <w:rPr/>
+        <w:t>This dynamic programming approach helps us find the minimum steps efficiently, as it reuses previously calculated results and avoids recomputation, achieving an optimal solution in O(n) time complexity.</w:t>
+      </w:r>
+    </w:p>
+    <w:p>
+      <w:pPr>
+        <w:pStyle w:val="BodyText"/>
+        <w:bidi w:val="0"/>
+        <w:jc w:val="start"/>
+        <w:rPr/>
+      </w:pPr>
+      <w:r>
+        <w:rPr/>
+      </w:r>
+    </w:p>
+    <w:p>
+      <w:pPr>
+        <w:pStyle w:val="Heading3"/>
+        <w:bidi w:val="0"/>
+        <w:jc w:val="start"/>
+        <w:rPr/>
+      </w:pPr>
+      <w:r>
+        <w:rPr/>
         <w:t>Summary</w:t>
       </w:r>
     </w:p>
@@ -589,7 +1636,6 @@
           <w:numId w:val="5"/>
         </w:numPr>
         <w:tabs>
-          <w:tab w:val="clear" w:pos="709"/>
           <w:tab w:val="left" w:pos="709" w:leader="none"/>
         </w:tabs>
         <w:bidi w:val="0"/>
@@ -617,7 +1663,6 @@
           <w:numId w:val="5"/>
         </w:numPr>
         <w:tabs>
-          <w:tab w:val="clear" w:pos="709"/>
           <w:tab w:val="left" w:pos="709" w:leader="none"/>
         </w:tabs>
         <w:bidi w:val="0"/>
@@ -645,7 +1690,6 @@
           <w:numId w:val="5"/>
         </w:numPr>
         <w:tabs>
-          <w:tab w:val="clear" w:pos="709"/>
           <w:tab w:val="left" w:pos="709" w:leader="none"/>
         </w:tabs>
         <w:bidi w:val="0"/>
@@ -717,7 +1761,6 @@
           <w:numId w:val="6"/>
         </w:numPr>
         <w:tabs>
-          <w:tab w:val="clear" w:pos="709"/>
           <w:tab w:val="left" w:pos="709" w:leader="none"/>
         </w:tabs>
         <w:bidi w:val="0"/>
@@ -745,7 +1788,6 @@
           <w:numId w:val="6"/>
         </w:numPr>
         <w:tabs>
-          <w:tab w:val="clear" w:pos="709"/>
           <w:tab w:val="left" w:pos="709" w:leader="none"/>
         </w:tabs>
         <w:bidi w:val="0"/>
@@ -829,7 +1871,6 @@
           <w:numId w:val="6"/>
         </w:numPr>
         <w:tabs>
-          <w:tab w:val="clear" w:pos="709"/>
           <w:tab w:val="left" w:pos="709" w:leader="none"/>
         </w:tabs>
         <w:bidi w:val="0"/>
@@ -876,7 +1917,6 @@
           <w:numId w:val="7"/>
         </w:numPr>
         <w:tabs>
-          <w:tab w:val="clear" w:pos="709"/>
           <w:tab w:val="left" w:pos="709" w:leader="none"/>
         </w:tabs>
         <w:bidi w:val="0"/>
@@ -904,7 +1944,6 @@
           <w:numId w:val="7"/>
         </w:numPr>
         <w:tabs>
-          <w:tab w:val="clear" w:pos="709"/>
           <w:tab w:val="left" w:pos="709" w:leader="none"/>
         </w:tabs>
         <w:bidi w:val="0"/>
@@ -988,7 +2027,6 @@
           <w:numId w:val="7"/>
         </w:numPr>
         <w:tabs>
-          <w:tab w:val="clear" w:pos="709"/>
           <w:tab w:val="left" w:pos="709" w:leader="none"/>
         </w:tabs>
         <w:bidi w:val="0"/>
@@ -1035,7 +2073,6 @@
           <w:numId w:val="8"/>
         </w:numPr>
         <w:tabs>
-          <w:tab w:val="clear" w:pos="709"/>
           <w:tab w:val="left" w:pos="709" w:leader="none"/>
         </w:tabs>
         <w:bidi w:val="0"/>
@@ -1063,7 +2100,6 @@
           <w:numId w:val="8"/>
         </w:numPr>
         <w:tabs>
-          <w:tab w:val="clear" w:pos="709"/>
           <w:tab w:val="left" w:pos="709" w:leader="none"/>
         </w:tabs>
         <w:bidi w:val="0"/>
@@ -1147,7 +2183,6 @@
           <w:numId w:val="8"/>
         </w:numPr>
         <w:tabs>
-          <w:tab w:val="clear" w:pos="709"/>
           <w:tab w:val="left" w:pos="709" w:leader="none"/>
         </w:tabs>
         <w:bidi w:val="0"/>
@@ -1194,7 +2229,6 @@
           <w:numId w:val="9"/>
         </w:numPr>
         <w:tabs>
-          <w:tab w:val="clear" w:pos="709"/>
           <w:tab w:val="left" w:pos="709" w:leader="none"/>
         </w:tabs>
         <w:bidi w:val="0"/>
@@ -1222,7 +2256,6 @@
           <w:numId w:val="9"/>
         </w:numPr>
         <w:tabs>
-          <w:tab w:val="clear" w:pos="709"/>
           <w:tab w:val="left" w:pos="709" w:leader="none"/>
         </w:tabs>
         <w:bidi w:val="0"/>
@@ -1306,7 +2339,6 @@
           <w:numId w:val="9"/>
         </w:numPr>
         <w:tabs>
-          <w:tab w:val="clear" w:pos="709"/>
           <w:tab w:val="left" w:pos="709" w:leader="none"/>
         </w:tabs>
         <w:bidi w:val="0"/>
@@ -1353,7 +2385,6 @@
           <w:numId w:val="10"/>
         </w:numPr>
         <w:tabs>
-          <w:tab w:val="clear" w:pos="709"/>
           <w:tab w:val="left" w:pos="709" w:leader="none"/>
         </w:tabs>
         <w:bidi w:val="0"/>
@@ -1381,7 +2412,6 @@
           <w:numId w:val="10"/>
         </w:numPr>
         <w:tabs>
-          <w:tab w:val="clear" w:pos="709"/>
           <w:tab w:val="left" w:pos="709" w:leader="none"/>
         </w:tabs>
         <w:bidi w:val="0"/>
@@ -1465,7 +2495,6 @@
           <w:numId w:val="10"/>
         </w:numPr>
         <w:tabs>
-          <w:tab w:val="clear" w:pos="709"/>
           <w:tab w:val="left" w:pos="709" w:leader="none"/>
         </w:tabs>
         <w:bidi w:val="0"/>
@@ -1515,7 +2544,6 @@
           <w:numId w:val="11"/>
         </w:numPr>
         <w:tabs>
-          <w:tab w:val="clear" w:pos="709"/>
           <w:tab w:val="left" w:pos="709" w:leader="none"/>
         </w:tabs>
         <w:bidi w:val="0"/>
@@ -1539,7 +2567,6 @@
           <w:numId w:val="11"/>
         </w:numPr>
         <w:tabs>
-          <w:tab w:val="clear" w:pos="709"/>
           <w:tab w:val="left" w:pos="709" w:leader="none"/>
         </w:tabs>
         <w:bidi w:val="0"/>
@@ -1563,7 +2590,6 @@
           <w:numId w:val="11"/>
         </w:numPr>
         <w:tabs>
-          <w:tab w:val="clear" w:pos="709"/>
           <w:tab w:val="left" w:pos="709" w:leader="none"/>
         </w:tabs>
         <w:bidi w:val="0"/>
@@ -1587,7 +2613,6 @@
           <w:numId w:val="11"/>
         </w:numPr>
         <w:tabs>
-          <w:tab w:val="clear" w:pos="709"/>
           <w:tab w:val="left" w:pos="709" w:leader="none"/>
         </w:tabs>
         <w:bidi w:val="0"/>
@@ -1632,6 +2657,7 @@
       <w:pgNumType w:fmt="decimal"/>
       <w:formProt w:val="false"/>
       <w:textDirection w:val="lrTb"/>
+      <w:docGrid w:type="default" w:linePitch="100" w:charSpace="0"/>
     </w:sectPr>
   </w:body>
 </w:document>
@@ -3111,6 +4137,806 @@
   <w:abstractNum w:abstractNumId="12">
     <w:lvl w:ilvl="0">
       <w:start w:val="1"/>
+      <w:numFmt w:val="bullet"/>
+      <w:lvlText w:val=""/>
+      <w:lvlJc w:val="start"/>
+      <w:pPr>
+        <w:tabs>
+          <w:tab w:val="num" w:pos="709"/>
+        </w:tabs>
+        <w:ind w:start="709" w:hanging="283"/>
+      </w:pPr>
+      <w:rPr>
+        <w:rFonts w:ascii="Symbol" w:hAnsi="Symbol" w:cs="Symbol" w:hint="default"/>
+      </w:rPr>
+    </w:lvl>
+    <w:lvl w:ilvl="1">
+      <w:start w:val="1"/>
+      <w:numFmt w:val="bullet"/>
+      <w:lvlText w:val=""/>
+      <w:lvlJc w:val="start"/>
+      <w:pPr>
+        <w:tabs>
+          <w:tab w:val="num" w:pos="1418"/>
+        </w:tabs>
+        <w:ind w:start="1418" w:hanging="283"/>
+      </w:pPr>
+      <w:rPr>
+        <w:rFonts w:ascii="Symbol" w:hAnsi="Symbol" w:cs="Symbol" w:hint="default"/>
+      </w:rPr>
+    </w:lvl>
+    <w:lvl w:ilvl="2">
+      <w:start w:val="1"/>
+      <w:numFmt w:val="bullet"/>
+      <w:lvlText w:val=""/>
+      <w:lvlJc w:val="start"/>
+      <w:pPr>
+        <w:tabs>
+          <w:tab w:val="num" w:pos="2127"/>
+        </w:tabs>
+        <w:ind w:start="2127" w:hanging="283"/>
+      </w:pPr>
+      <w:rPr>
+        <w:rFonts w:ascii="Symbol" w:hAnsi="Symbol" w:cs="Symbol" w:hint="default"/>
+      </w:rPr>
+    </w:lvl>
+    <w:lvl w:ilvl="3">
+      <w:start w:val="1"/>
+      <w:numFmt w:val="bullet"/>
+      <w:lvlText w:val=""/>
+      <w:lvlJc w:val="start"/>
+      <w:pPr>
+        <w:tabs>
+          <w:tab w:val="num" w:pos="2836"/>
+        </w:tabs>
+        <w:ind w:start="2836" w:hanging="283"/>
+      </w:pPr>
+      <w:rPr>
+        <w:rFonts w:ascii="Symbol" w:hAnsi="Symbol" w:cs="Symbol" w:hint="default"/>
+      </w:rPr>
+    </w:lvl>
+    <w:lvl w:ilvl="4">
+      <w:start w:val="1"/>
+      <w:numFmt w:val="bullet"/>
+      <w:lvlText w:val=""/>
+      <w:lvlJc w:val="start"/>
+      <w:pPr>
+        <w:tabs>
+          <w:tab w:val="num" w:pos="3545"/>
+        </w:tabs>
+        <w:ind w:start="3545" w:hanging="283"/>
+      </w:pPr>
+      <w:rPr>
+        <w:rFonts w:ascii="Symbol" w:hAnsi="Symbol" w:cs="Symbol" w:hint="default"/>
+      </w:rPr>
+    </w:lvl>
+    <w:lvl w:ilvl="5">
+      <w:start w:val="1"/>
+      <w:numFmt w:val="bullet"/>
+      <w:lvlText w:val=""/>
+      <w:lvlJc w:val="start"/>
+      <w:pPr>
+        <w:tabs>
+          <w:tab w:val="num" w:pos="4254"/>
+        </w:tabs>
+        <w:ind w:start="4254" w:hanging="283"/>
+      </w:pPr>
+      <w:rPr>
+        <w:rFonts w:ascii="Symbol" w:hAnsi="Symbol" w:cs="Symbol" w:hint="default"/>
+      </w:rPr>
+    </w:lvl>
+    <w:lvl w:ilvl="6">
+      <w:start w:val="1"/>
+      <w:numFmt w:val="bullet"/>
+      <w:lvlText w:val=""/>
+      <w:lvlJc w:val="start"/>
+      <w:pPr>
+        <w:tabs>
+          <w:tab w:val="num" w:pos="4963"/>
+        </w:tabs>
+        <w:ind w:start="4963" w:hanging="283"/>
+      </w:pPr>
+      <w:rPr>
+        <w:rFonts w:ascii="Symbol" w:hAnsi="Symbol" w:cs="Symbol" w:hint="default"/>
+      </w:rPr>
+    </w:lvl>
+    <w:lvl w:ilvl="7">
+      <w:start w:val="1"/>
+      <w:numFmt w:val="bullet"/>
+      <w:lvlText w:val=""/>
+      <w:lvlJc w:val="start"/>
+      <w:pPr>
+        <w:tabs>
+          <w:tab w:val="num" w:pos="5672"/>
+        </w:tabs>
+        <w:ind w:start="5672" w:hanging="283"/>
+      </w:pPr>
+      <w:rPr>
+        <w:rFonts w:ascii="Symbol" w:hAnsi="Symbol" w:cs="Symbol" w:hint="default"/>
+      </w:rPr>
+    </w:lvl>
+    <w:lvl w:ilvl="8">
+      <w:start w:val="1"/>
+      <w:numFmt w:val="bullet"/>
+      <w:lvlText w:val=""/>
+      <w:lvlJc w:val="start"/>
+      <w:pPr>
+        <w:tabs>
+          <w:tab w:val="num" w:pos="6381"/>
+        </w:tabs>
+        <w:ind w:start="6381" w:hanging="283"/>
+      </w:pPr>
+      <w:rPr>
+        <w:rFonts w:ascii="Symbol" w:hAnsi="Symbol" w:cs="Symbol" w:hint="default"/>
+      </w:rPr>
+    </w:lvl>
+  </w:abstractNum>
+  <w:abstractNum w:abstractNumId="13">
+    <w:lvl w:ilvl="0">
+      <w:start w:val="1"/>
+      <w:numFmt w:val="decimal"/>
+      <w:lvlText w:val="%1."/>
+      <w:lvlJc w:val="start"/>
+      <w:pPr>
+        <w:tabs>
+          <w:tab w:val="num" w:pos="709"/>
+        </w:tabs>
+        <w:ind w:start="709" w:hanging="283"/>
+      </w:pPr>
+      <w:rPr/>
+    </w:lvl>
+    <w:lvl w:ilvl="1">
+      <w:start w:val="1"/>
+      <w:numFmt w:val="bullet"/>
+      <w:lvlText w:val=""/>
+      <w:lvlJc w:val="start"/>
+      <w:pPr>
+        <w:tabs>
+          <w:tab w:val="num" w:pos="1418"/>
+        </w:tabs>
+        <w:ind w:start="1418" w:hanging="283"/>
+      </w:pPr>
+      <w:rPr>
+        <w:rFonts w:ascii="Symbol" w:hAnsi="Symbol" w:cs="Symbol" w:hint="default"/>
+      </w:rPr>
+    </w:lvl>
+    <w:lvl w:ilvl="2">
+      <w:start w:val="1"/>
+      <w:numFmt w:val="bullet"/>
+      <w:lvlText w:val=""/>
+      <w:lvlJc w:val="start"/>
+      <w:pPr>
+        <w:tabs>
+          <w:tab w:val="num" w:pos="2127"/>
+        </w:tabs>
+        <w:ind w:start="2127" w:hanging="283"/>
+      </w:pPr>
+      <w:rPr>
+        <w:rFonts w:ascii="Symbol" w:hAnsi="Symbol" w:cs="Symbol" w:hint="default"/>
+      </w:rPr>
+    </w:lvl>
+    <w:lvl w:ilvl="3">
+      <w:start w:val="1"/>
+      <w:numFmt w:val="bullet"/>
+      <w:lvlText w:val=""/>
+      <w:lvlJc w:val="start"/>
+      <w:pPr>
+        <w:tabs>
+          <w:tab w:val="num" w:pos="2836"/>
+        </w:tabs>
+        <w:ind w:start="2836" w:hanging="283"/>
+      </w:pPr>
+      <w:rPr>
+        <w:rFonts w:ascii="Symbol" w:hAnsi="Symbol" w:cs="Symbol" w:hint="default"/>
+      </w:rPr>
+    </w:lvl>
+    <w:lvl w:ilvl="4">
+      <w:start w:val="1"/>
+      <w:numFmt w:val="bullet"/>
+      <w:lvlText w:val=""/>
+      <w:lvlJc w:val="start"/>
+      <w:pPr>
+        <w:tabs>
+          <w:tab w:val="num" w:pos="3545"/>
+        </w:tabs>
+        <w:ind w:start="3545" w:hanging="283"/>
+      </w:pPr>
+      <w:rPr>
+        <w:rFonts w:ascii="Symbol" w:hAnsi="Symbol" w:cs="Symbol" w:hint="default"/>
+      </w:rPr>
+    </w:lvl>
+    <w:lvl w:ilvl="5">
+      <w:start w:val="1"/>
+      <w:numFmt w:val="bullet"/>
+      <w:lvlText w:val=""/>
+      <w:lvlJc w:val="start"/>
+      <w:pPr>
+        <w:tabs>
+          <w:tab w:val="num" w:pos="4254"/>
+        </w:tabs>
+        <w:ind w:start="4254" w:hanging="283"/>
+      </w:pPr>
+      <w:rPr>
+        <w:rFonts w:ascii="Symbol" w:hAnsi="Symbol" w:cs="Symbol" w:hint="default"/>
+      </w:rPr>
+    </w:lvl>
+    <w:lvl w:ilvl="6">
+      <w:start w:val="1"/>
+      <w:numFmt w:val="bullet"/>
+      <w:lvlText w:val=""/>
+      <w:lvlJc w:val="start"/>
+      <w:pPr>
+        <w:tabs>
+          <w:tab w:val="num" w:pos="4963"/>
+        </w:tabs>
+        <w:ind w:start="4963" w:hanging="283"/>
+      </w:pPr>
+      <w:rPr>
+        <w:rFonts w:ascii="Symbol" w:hAnsi="Symbol" w:cs="Symbol" w:hint="default"/>
+      </w:rPr>
+    </w:lvl>
+    <w:lvl w:ilvl="7">
+      <w:start w:val="1"/>
+      <w:numFmt w:val="bullet"/>
+      <w:lvlText w:val=""/>
+      <w:lvlJc w:val="start"/>
+      <w:pPr>
+        <w:tabs>
+          <w:tab w:val="num" w:pos="5672"/>
+        </w:tabs>
+        <w:ind w:start="5672" w:hanging="283"/>
+      </w:pPr>
+      <w:rPr>
+        <w:rFonts w:ascii="Symbol" w:hAnsi="Symbol" w:cs="Symbol" w:hint="default"/>
+      </w:rPr>
+    </w:lvl>
+    <w:lvl w:ilvl="8">
+      <w:start w:val="1"/>
+      <w:numFmt w:val="bullet"/>
+      <w:lvlText w:val=""/>
+      <w:lvlJc w:val="start"/>
+      <w:pPr>
+        <w:tabs>
+          <w:tab w:val="num" w:pos="6381"/>
+        </w:tabs>
+        <w:ind w:start="6381" w:hanging="283"/>
+      </w:pPr>
+      <w:rPr>
+        <w:rFonts w:ascii="Symbol" w:hAnsi="Symbol" w:cs="Symbol" w:hint="default"/>
+      </w:rPr>
+    </w:lvl>
+  </w:abstractNum>
+  <w:abstractNum w:abstractNumId="14">
+    <w:lvl w:ilvl="0">
+      <w:start w:val="1"/>
+      <w:numFmt w:val="bullet"/>
+      <w:lvlText w:val=""/>
+      <w:lvlJc w:val="start"/>
+      <w:pPr>
+        <w:tabs>
+          <w:tab w:val="num" w:pos="709"/>
+        </w:tabs>
+        <w:ind w:start="709" w:hanging="283"/>
+      </w:pPr>
+      <w:rPr>
+        <w:rFonts w:ascii="Symbol" w:hAnsi="Symbol" w:cs="Symbol" w:hint="default"/>
+      </w:rPr>
+    </w:lvl>
+    <w:lvl w:ilvl="1">
+      <w:start w:val="1"/>
+      <w:numFmt w:val="bullet"/>
+      <w:lvlText w:val=""/>
+      <w:lvlJc w:val="start"/>
+      <w:pPr>
+        <w:tabs>
+          <w:tab w:val="num" w:pos="1418"/>
+        </w:tabs>
+        <w:ind w:start="1418" w:hanging="283"/>
+      </w:pPr>
+      <w:rPr>
+        <w:rFonts w:ascii="Symbol" w:hAnsi="Symbol" w:cs="Symbol" w:hint="default"/>
+      </w:rPr>
+    </w:lvl>
+    <w:lvl w:ilvl="2">
+      <w:start w:val="1"/>
+      <w:numFmt w:val="bullet"/>
+      <w:lvlText w:val=""/>
+      <w:lvlJc w:val="start"/>
+      <w:pPr>
+        <w:tabs>
+          <w:tab w:val="num" w:pos="2127"/>
+        </w:tabs>
+        <w:ind w:start="2127" w:hanging="283"/>
+      </w:pPr>
+      <w:rPr>
+        <w:rFonts w:ascii="Symbol" w:hAnsi="Symbol" w:cs="Symbol" w:hint="default"/>
+      </w:rPr>
+    </w:lvl>
+    <w:lvl w:ilvl="3">
+      <w:start w:val="1"/>
+      <w:numFmt w:val="bullet"/>
+      <w:lvlText w:val=""/>
+      <w:lvlJc w:val="start"/>
+      <w:pPr>
+        <w:tabs>
+          <w:tab w:val="num" w:pos="2836"/>
+        </w:tabs>
+        <w:ind w:start="2836" w:hanging="283"/>
+      </w:pPr>
+      <w:rPr>
+        <w:rFonts w:ascii="Symbol" w:hAnsi="Symbol" w:cs="Symbol" w:hint="default"/>
+      </w:rPr>
+    </w:lvl>
+    <w:lvl w:ilvl="4">
+      <w:start w:val="1"/>
+      <w:numFmt w:val="bullet"/>
+      <w:lvlText w:val=""/>
+      <w:lvlJc w:val="start"/>
+      <w:pPr>
+        <w:tabs>
+          <w:tab w:val="num" w:pos="3545"/>
+        </w:tabs>
+        <w:ind w:start="3545" w:hanging="283"/>
+      </w:pPr>
+      <w:rPr>
+        <w:rFonts w:ascii="Symbol" w:hAnsi="Symbol" w:cs="Symbol" w:hint="default"/>
+      </w:rPr>
+    </w:lvl>
+    <w:lvl w:ilvl="5">
+      <w:start w:val="1"/>
+      <w:numFmt w:val="bullet"/>
+      <w:lvlText w:val=""/>
+      <w:lvlJc w:val="start"/>
+      <w:pPr>
+        <w:tabs>
+          <w:tab w:val="num" w:pos="4254"/>
+        </w:tabs>
+        <w:ind w:start="4254" w:hanging="283"/>
+      </w:pPr>
+      <w:rPr>
+        <w:rFonts w:ascii="Symbol" w:hAnsi="Symbol" w:cs="Symbol" w:hint="default"/>
+      </w:rPr>
+    </w:lvl>
+    <w:lvl w:ilvl="6">
+      <w:start w:val="1"/>
+      <w:numFmt w:val="bullet"/>
+      <w:lvlText w:val=""/>
+      <w:lvlJc w:val="start"/>
+      <w:pPr>
+        <w:tabs>
+          <w:tab w:val="num" w:pos="4963"/>
+        </w:tabs>
+        <w:ind w:start="4963" w:hanging="283"/>
+      </w:pPr>
+      <w:rPr>
+        <w:rFonts w:ascii="Symbol" w:hAnsi="Symbol" w:cs="Symbol" w:hint="default"/>
+      </w:rPr>
+    </w:lvl>
+    <w:lvl w:ilvl="7">
+      <w:start w:val="1"/>
+      <w:numFmt w:val="bullet"/>
+      <w:lvlText w:val=""/>
+      <w:lvlJc w:val="start"/>
+      <w:pPr>
+        <w:tabs>
+          <w:tab w:val="num" w:pos="5672"/>
+        </w:tabs>
+        <w:ind w:start="5672" w:hanging="283"/>
+      </w:pPr>
+      <w:rPr>
+        <w:rFonts w:ascii="Symbol" w:hAnsi="Symbol" w:cs="Symbol" w:hint="default"/>
+      </w:rPr>
+    </w:lvl>
+    <w:lvl w:ilvl="8">
+      <w:start w:val="1"/>
+      <w:numFmt w:val="bullet"/>
+      <w:lvlText w:val=""/>
+      <w:lvlJc w:val="start"/>
+      <w:pPr>
+        <w:tabs>
+          <w:tab w:val="num" w:pos="6381"/>
+        </w:tabs>
+        <w:ind w:start="6381" w:hanging="283"/>
+      </w:pPr>
+      <w:rPr>
+        <w:rFonts w:ascii="Symbol" w:hAnsi="Symbol" w:cs="Symbol" w:hint="default"/>
+      </w:rPr>
+    </w:lvl>
+  </w:abstractNum>
+  <w:abstractNum w:abstractNumId="15">
+    <w:lvl w:ilvl="0">
+      <w:start w:val="1"/>
+      <w:numFmt w:val="bullet"/>
+      <w:lvlText w:val=""/>
+      <w:lvlJc w:val="start"/>
+      <w:pPr>
+        <w:tabs>
+          <w:tab w:val="num" w:pos="709"/>
+        </w:tabs>
+        <w:ind w:start="709" w:hanging="283"/>
+      </w:pPr>
+      <w:rPr>
+        <w:rFonts w:ascii="Symbol" w:hAnsi="Symbol" w:cs="Symbol" w:hint="default"/>
+      </w:rPr>
+    </w:lvl>
+    <w:lvl w:ilvl="1">
+      <w:start w:val="1"/>
+      <w:numFmt w:val="bullet"/>
+      <w:lvlText w:val=""/>
+      <w:lvlJc w:val="start"/>
+      <w:pPr>
+        <w:tabs>
+          <w:tab w:val="num" w:pos="1418"/>
+        </w:tabs>
+        <w:ind w:start="1418" w:hanging="283"/>
+      </w:pPr>
+      <w:rPr>
+        <w:rFonts w:ascii="Symbol" w:hAnsi="Symbol" w:cs="Symbol" w:hint="default"/>
+      </w:rPr>
+    </w:lvl>
+    <w:lvl w:ilvl="2">
+      <w:start w:val="1"/>
+      <w:numFmt w:val="bullet"/>
+      <w:lvlText w:val=""/>
+      <w:lvlJc w:val="start"/>
+      <w:pPr>
+        <w:tabs>
+          <w:tab w:val="num" w:pos="2127"/>
+        </w:tabs>
+        <w:ind w:start="2127" w:hanging="283"/>
+      </w:pPr>
+      <w:rPr>
+        <w:rFonts w:ascii="Symbol" w:hAnsi="Symbol" w:cs="Symbol" w:hint="default"/>
+      </w:rPr>
+    </w:lvl>
+    <w:lvl w:ilvl="3">
+      <w:start w:val="1"/>
+      <w:numFmt w:val="bullet"/>
+      <w:lvlText w:val=""/>
+      <w:lvlJc w:val="start"/>
+      <w:pPr>
+        <w:tabs>
+          <w:tab w:val="num" w:pos="2836"/>
+        </w:tabs>
+        <w:ind w:start="2836" w:hanging="283"/>
+      </w:pPr>
+      <w:rPr>
+        <w:rFonts w:ascii="Symbol" w:hAnsi="Symbol" w:cs="Symbol" w:hint="default"/>
+      </w:rPr>
+    </w:lvl>
+    <w:lvl w:ilvl="4">
+      <w:start w:val="1"/>
+      <w:numFmt w:val="bullet"/>
+      <w:lvlText w:val=""/>
+      <w:lvlJc w:val="start"/>
+      <w:pPr>
+        <w:tabs>
+          <w:tab w:val="num" w:pos="3545"/>
+        </w:tabs>
+        <w:ind w:start="3545" w:hanging="283"/>
+      </w:pPr>
+      <w:rPr>
+        <w:rFonts w:ascii="Symbol" w:hAnsi="Symbol" w:cs="Symbol" w:hint="default"/>
+      </w:rPr>
+    </w:lvl>
+    <w:lvl w:ilvl="5">
+      <w:start w:val="1"/>
+      <w:numFmt w:val="bullet"/>
+      <w:lvlText w:val=""/>
+      <w:lvlJc w:val="start"/>
+      <w:pPr>
+        <w:tabs>
+          <w:tab w:val="num" w:pos="4254"/>
+        </w:tabs>
+        <w:ind w:start="4254" w:hanging="283"/>
+      </w:pPr>
+      <w:rPr>
+        <w:rFonts w:ascii="Symbol" w:hAnsi="Symbol" w:cs="Symbol" w:hint="default"/>
+      </w:rPr>
+    </w:lvl>
+    <w:lvl w:ilvl="6">
+      <w:start w:val="1"/>
+      <w:numFmt w:val="bullet"/>
+      <w:lvlText w:val=""/>
+      <w:lvlJc w:val="start"/>
+      <w:pPr>
+        <w:tabs>
+          <w:tab w:val="num" w:pos="4963"/>
+        </w:tabs>
+        <w:ind w:start="4963" w:hanging="283"/>
+      </w:pPr>
+      <w:rPr>
+        <w:rFonts w:ascii="Symbol" w:hAnsi="Symbol" w:cs="Symbol" w:hint="default"/>
+      </w:rPr>
+    </w:lvl>
+    <w:lvl w:ilvl="7">
+      <w:start w:val="1"/>
+      <w:numFmt w:val="bullet"/>
+      <w:lvlText w:val=""/>
+      <w:lvlJc w:val="start"/>
+      <w:pPr>
+        <w:tabs>
+          <w:tab w:val="num" w:pos="5672"/>
+        </w:tabs>
+        <w:ind w:start="5672" w:hanging="283"/>
+      </w:pPr>
+      <w:rPr>
+        <w:rFonts w:ascii="Symbol" w:hAnsi="Symbol" w:cs="Symbol" w:hint="default"/>
+      </w:rPr>
+    </w:lvl>
+    <w:lvl w:ilvl="8">
+      <w:start w:val="1"/>
+      <w:numFmt w:val="bullet"/>
+      <w:lvlText w:val=""/>
+      <w:lvlJc w:val="start"/>
+      <w:pPr>
+        <w:tabs>
+          <w:tab w:val="num" w:pos="6381"/>
+        </w:tabs>
+        <w:ind w:start="6381" w:hanging="283"/>
+      </w:pPr>
+      <w:rPr>
+        <w:rFonts w:ascii="Symbol" w:hAnsi="Symbol" w:cs="Symbol" w:hint="default"/>
+      </w:rPr>
+    </w:lvl>
+  </w:abstractNum>
+  <w:abstractNum w:abstractNumId="16">
+    <w:lvl w:ilvl="0">
+      <w:start w:val="1"/>
+      <w:numFmt w:val="decimal"/>
+      <w:lvlText w:val="%1."/>
+      <w:lvlJc w:val="start"/>
+      <w:pPr>
+        <w:tabs>
+          <w:tab w:val="num" w:pos="709"/>
+        </w:tabs>
+        <w:ind w:start="709" w:hanging="283"/>
+      </w:pPr>
+      <w:rPr/>
+    </w:lvl>
+    <w:lvl w:ilvl="1">
+      <w:start w:val="1"/>
+      <w:numFmt w:val="decimal"/>
+      <w:lvlText w:val="%2."/>
+      <w:lvlJc w:val="start"/>
+      <w:pPr>
+        <w:tabs>
+          <w:tab w:val="num" w:pos="1418"/>
+        </w:tabs>
+        <w:ind w:start="1418" w:hanging="283"/>
+      </w:pPr>
+      <w:rPr/>
+    </w:lvl>
+    <w:lvl w:ilvl="2">
+      <w:start w:val="1"/>
+      <w:numFmt w:val="decimal"/>
+      <w:lvlText w:val="%3."/>
+      <w:lvlJc w:val="start"/>
+      <w:pPr>
+        <w:tabs>
+          <w:tab w:val="num" w:pos="2127"/>
+        </w:tabs>
+        <w:ind w:start="2127" w:hanging="283"/>
+      </w:pPr>
+      <w:rPr/>
+    </w:lvl>
+    <w:lvl w:ilvl="3">
+      <w:start w:val="1"/>
+      <w:numFmt w:val="decimal"/>
+      <w:lvlText w:val="%4."/>
+      <w:lvlJc w:val="start"/>
+      <w:pPr>
+        <w:tabs>
+          <w:tab w:val="num" w:pos="2836"/>
+        </w:tabs>
+        <w:ind w:start="2836" w:hanging="283"/>
+      </w:pPr>
+      <w:rPr/>
+    </w:lvl>
+    <w:lvl w:ilvl="4">
+      <w:start w:val="1"/>
+      <w:numFmt w:val="decimal"/>
+      <w:lvlText w:val="%5."/>
+      <w:lvlJc w:val="start"/>
+      <w:pPr>
+        <w:tabs>
+          <w:tab w:val="num" w:pos="3545"/>
+        </w:tabs>
+        <w:ind w:start="3545" w:hanging="283"/>
+      </w:pPr>
+      <w:rPr/>
+    </w:lvl>
+    <w:lvl w:ilvl="5">
+      <w:start w:val="1"/>
+      <w:numFmt w:val="decimal"/>
+      <w:lvlText w:val="%6."/>
+      <w:lvlJc w:val="start"/>
+      <w:pPr>
+        <w:tabs>
+          <w:tab w:val="num" w:pos="4254"/>
+        </w:tabs>
+        <w:ind w:start="4254" w:hanging="283"/>
+      </w:pPr>
+      <w:rPr/>
+    </w:lvl>
+    <w:lvl w:ilvl="6">
+      <w:start w:val="1"/>
+      <w:numFmt w:val="decimal"/>
+      <w:lvlText w:val="%7."/>
+      <w:lvlJc w:val="start"/>
+      <w:pPr>
+        <w:tabs>
+          <w:tab w:val="num" w:pos="4963"/>
+        </w:tabs>
+        <w:ind w:start="4963" w:hanging="283"/>
+      </w:pPr>
+      <w:rPr/>
+    </w:lvl>
+    <w:lvl w:ilvl="7">
+      <w:start w:val="1"/>
+      <w:numFmt w:val="decimal"/>
+      <w:lvlText w:val="%8."/>
+      <w:lvlJc w:val="start"/>
+      <w:pPr>
+        <w:tabs>
+          <w:tab w:val="num" w:pos="5672"/>
+        </w:tabs>
+        <w:ind w:start="5672" w:hanging="283"/>
+      </w:pPr>
+      <w:rPr/>
+    </w:lvl>
+    <w:lvl w:ilvl="8">
+      <w:start w:val="1"/>
+      <w:numFmt w:val="decimal"/>
+      <w:lvlText w:val="%9."/>
+      <w:lvlJc w:val="start"/>
+      <w:pPr>
+        <w:tabs>
+          <w:tab w:val="num" w:pos="6381"/>
+        </w:tabs>
+        <w:ind w:start="6381" w:hanging="283"/>
+      </w:pPr>
+      <w:rPr/>
+    </w:lvl>
+  </w:abstractNum>
+  <w:abstractNum w:abstractNumId="17">
+    <w:lvl w:ilvl="0">
+      <w:start w:val="1"/>
+      <w:numFmt w:val="decimal"/>
+      <w:lvlText w:val="%1."/>
+      <w:lvlJc w:val="start"/>
+      <w:pPr>
+        <w:tabs>
+          <w:tab w:val="num" w:pos="709"/>
+        </w:tabs>
+        <w:ind w:start="709" w:hanging="283"/>
+      </w:pPr>
+      <w:rPr/>
+    </w:lvl>
+    <w:lvl w:ilvl="1">
+      <w:start w:val="1"/>
+      <w:numFmt w:val="bullet"/>
+      <w:lvlText w:val=""/>
+      <w:lvlJc w:val="start"/>
+      <w:pPr>
+        <w:tabs>
+          <w:tab w:val="num" w:pos="1418"/>
+        </w:tabs>
+        <w:ind w:start="1418" w:hanging="283"/>
+      </w:pPr>
+      <w:rPr>
+        <w:rFonts w:ascii="Symbol" w:hAnsi="Symbol" w:cs="Symbol" w:hint="default"/>
+      </w:rPr>
+    </w:lvl>
+    <w:lvl w:ilvl="2">
+      <w:start w:val="1"/>
+      <w:numFmt w:val="bullet"/>
+      <w:lvlText w:val=""/>
+      <w:lvlJc w:val="start"/>
+      <w:pPr>
+        <w:tabs>
+          <w:tab w:val="num" w:pos="2127"/>
+        </w:tabs>
+        <w:ind w:start="2127" w:hanging="283"/>
+      </w:pPr>
+      <w:rPr>
+        <w:rFonts w:ascii="Symbol" w:hAnsi="Symbol" w:cs="Symbol" w:hint="default"/>
+      </w:rPr>
+    </w:lvl>
+    <w:lvl w:ilvl="3">
+      <w:start w:val="1"/>
+      <w:numFmt w:val="bullet"/>
+      <w:lvlText w:val=""/>
+      <w:lvlJc w:val="start"/>
+      <w:pPr>
+        <w:tabs>
+          <w:tab w:val="num" w:pos="2836"/>
+        </w:tabs>
+        <w:ind w:start="2836" w:hanging="283"/>
+      </w:pPr>
+      <w:rPr>
+        <w:rFonts w:ascii="Symbol" w:hAnsi="Symbol" w:cs="Symbol" w:hint="default"/>
+      </w:rPr>
+    </w:lvl>
+    <w:lvl w:ilvl="4">
+      <w:start w:val="1"/>
+      <w:numFmt w:val="bullet"/>
+      <w:lvlText w:val=""/>
+      <w:lvlJc w:val="start"/>
+      <w:pPr>
+        <w:tabs>
+          <w:tab w:val="num" w:pos="3545"/>
+        </w:tabs>
+        <w:ind w:start="3545" w:hanging="283"/>
+      </w:pPr>
+      <w:rPr>
+        <w:rFonts w:ascii="Symbol" w:hAnsi="Symbol" w:cs="Symbol" w:hint="default"/>
+      </w:rPr>
+    </w:lvl>
+    <w:lvl w:ilvl="5">
+      <w:start w:val="1"/>
+      <w:numFmt w:val="bullet"/>
+      <w:lvlText w:val=""/>
+      <w:lvlJc w:val="start"/>
+      <w:pPr>
+        <w:tabs>
+          <w:tab w:val="num" w:pos="4254"/>
+        </w:tabs>
+        <w:ind w:start="4254" w:hanging="283"/>
+      </w:pPr>
+      <w:rPr>
+        <w:rFonts w:ascii="Symbol" w:hAnsi="Symbol" w:cs="Symbol" w:hint="default"/>
+      </w:rPr>
+    </w:lvl>
+    <w:lvl w:ilvl="6">
+      <w:start w:val="1"/>
+      <w:numFmt w:val="bullet"/>
+      <w:lvlText w:val=""/>
+      <w:lvlJc w:val="start"/>
+      <w:pPr>
+        <w:tabs>
+          <w:tab w:val="num" w:pos="4963"/>
+        </w:tabs>
+        <w:ind w:start="4963" w:hanging="283"/>
+      </w:pPr>
+      <w:rPr>
+        <w:rFonts w:ascii="Symbol" w:hAnsi="Symbol" w:cs="Symbol" w:hint="default"/>
+      </w:rPr>
+    </w:lvl>
+    <w:lvl w:ilvl="7">
+      <w:start w:val="1"/>
+      <w:numFmt w:val="bullet"/>
+      <w:lvlText w:val=""/>
+      <w:lvlJc w:val="start"/>
+      <w:pPr>
+        <w:tabs>
+          <w:tab w:val="num" w:pos="5672"/>
+        </w:tabs>
+        <w:ind w:start="5672" w:hanging="283"/>
+      </w:pPr>
+      <w:rPr>
+        <w:rFonts w:ascii="Symbol" w:hAnsi="Symbol" w:cs="Symbol" w:hint="default"/>
+      </w:rPr>
+    </w:lvl>
+    <w:lvl w:ilvl="8">
+      <w:start w:val="1"/>
+      <w:numFmt w:val="bullet"/>
+      <w:lvlText w:val=""/>
+      <w:lvlJc w:val="start"/>
+      <w:pPr>
+        <w:tabs>
+          <w:tab w:val="num" w:pos="6381"/>
+        </w:tabs>
+        <w:ind w:start="6381" w:hanging="283"/>
+      </w:pPr>
+      <w:rPr>
+        <w:rFonts w:ascii="Symbol" w:hAnsi="Symbol" w:cs="Symbol" w:hint="default"/>
+      </w:rPr>
+    </w:lvl>
+  </w:abstractNum>
+  <w:abstractNum w:abstractNumId="18">
+    <w:lvl w:ilvl="0">
+      <w:start w:val="1"/>
       <w:numFmt w:val="none"/>
       <w:suff w:val="nothing"/>
       <w:lvlText w:val=""/>
@@ -3137,7 +4963,6 @@
     </w:lvl>
     <w:lvl w:ilvl="2">
       <w:start w:val="1"/>
-      <w:pStyle w:val="Heading3"/>
       <w:numFmt w:val="none"/>
       <w:suff w:val="nothing"/>
       <w:lvlText w:val=""/>
@@ -3151,7 +4976,6 @@
     </w:lvl>
     <w:lvl w:ilvl="3">
       <w:start w:val="1"/>
-      <w:pStyle w:val="Heading4"/>
       <w:numFmt w:val="none"/>
       <w:suff w:val="nothing"/>
       <w:lvlText w:val=""/>
@@ -3265,6 +5089,24 @@
   <w:num w:numId="12">
     <w:abstractNumId w:val="12"/>
   </w:num>
+  <w:num w:numId="13">
+    <w:abstractNumId w:val="13"/>
+  </w:num>
+  <w:num w:numId="14">
+    <w:abstractNumId w:val="14"/>
+  </w:num>
+  <w:num w:numId="15">
+    <w:abstractNumId w:val="15"/>
+  </w:num>
+  <w:num w:numId="16">
+    <w:abstractNumId w:val="16"/>
+  </w:num>
+  <w:num w:numId="17">
+    <w:abstractNumId w:val="17"/>
+  </w:num>
+  <w:num w:numId="18">
+    <w:abstractNumId w:val="18"/>
+  </w:num>
 </w:numbering>
 </file>
 
@@ -3282,7 +5124,6 @@
     </w:rPrDefault>
     <w:pPrDefault>
       <w:pPr>
-        <w:widowControl/>
         <w:suppressAutoHyphens w:val="true"/>
       </w:pPr>
     </w:pPrDefault>
@@ -3292,7 +5133,10 @@
     <w:qFormat/>
     <w:pPr>
       <w:widowControl/>
+      <w:suppressAutoHyphens w:val="true"/>
       <w:bidi w:val="0"/>
+      <w:spacing w:before="0" w:after="0"/>
+      <w:jc w:val="start"/>
     </w:pPr>
     <w:rPr>
       <w:rFonts w:ascii="Liberation Serif" w:hAnsi="Liberation Serif" w:eastAsia="Noto Serif CJK SC" w:cs="Noto Sans Devanagari"/>

</xml_diff>